<commit_message>
Drop Objective 3, upgrade report to high-res assets and a professional layout
- Remove Objective 3 (Raspberry Pi hardware benchmarking) from the
  progress report and from the original proposal doc (Mini_Project
  Group 7.docx) — it was never executed, so it no longer appears as
  a claimed objective anywhere in the repo.
- Re-capture all dashboard screenshots at 2x device-scale (3200x2000
  source) and re-encode the demo video at a much higher bitrate
  (CRF 16) so both are legible at print/full-screen size.
- Report: real bordered/zebra-striped tables, bold name/index/
  supervisor fields, framed screenshots, title rule, and a footer
  with page numbers.
- Fix a bug where the results/crypto-audit tables silently averaged
  together two different same-day demo runs; now isolates only the
  latest run by walking back to the last round_id == 1.
</commit_message>
<xml_diff>
--- a/FL_Ghana_Progress_Report.docx
+++ b/FL_Ghana_Progress_Report.docx
@@ -10,7 +10,7 @@
         <w:rPr>
           <w:b/>
           <w:color w:val="0F3460"/>
-          <w:sz w:val="30"/>
+          <w:sz w:val="32"/>
         </w:rPr>
         <w:t>Cross-School Federated Learning for Privacy-Preserving</w:t>
       </w:r>
@@ -18,7 +18,7 @@
         <w:rPr>
           <w:b/>
           <w:color w:val="0F3460"/>
-          <w:sz w:val="30"/>
+          <w:sz w:val="32"/>
         </w:rPr>
         <w:br/>
         <w:t>Student Progress Tracking in Ghanaian District Schools</w:t>
@@ -26,7 +26,6 @@
     </w:p>
     <w:p>
       <w:pPr>
-        <w:spacing w:after="160"/>
         <w:jc w:val="center"/>
       </w:pPr>
       <w:r>
@@ -35,8 +34,25 @@
           <w:color w:val="6B7280"/>
           <w:sz w:val="19"/>
         </w:rPr>
-        <w:t>Project 12 — Group 7  |  CS Department, 2026 Batch  |  Supervisor: Dr. Eric Opoku Osei</w:t>
+        <w:t xml:space="preserve">Project 12 — Group 7  |  CS Department, 2026 Batch  |  Supervisor: </w:t>
       </w:r>
+      <w:r>
+        <w:rPr>
+          <w:b/>
+          <w:i/>
+          <w:color w:val="6B7280"/>
+          <w:sz w:val="19"/>
+        </w:rPr>
+        <w:t>Dr. Eric Opoku Osei</w:t>
+      </w:r>
+    </w:p>
+    <w:p>
+      <w:pPr>
+        <w:pBdr>
+          <w:bottom w:val="single" w:sz="18" w:space="1" w:color="C99A3D"/>
+        </w:pBdr>
+        <w:spacing w:before="40" w:after="200"/>
+      </w:pPr>
     </w:p>
     <w:p>
       <w:pPr>
@@ -55,6 +71,14 @@
       <w:tblPr>
         <w:tblW w:w="0" w:type="auto"/>
         <w:jc w:val="center"/>
+        <w:tblBorders>
+          <w:top w:val="single" w:sz="4" w:space="0" w:color="C7CDD6"/>
+          <w:left w:val="single" w:sz="4" w:space="0" w:color="C7CDD6"/>
+          <w:bottom w:val="single" w:sz="4" w:space="0" w:color="C7CDD6"/>
+          <w:right w:val="single" w:sz="4" w:space="0" w:color="C7CDD6"/>
+          <w:insideH w:val="single" w:sz="4" w:space="0" w:color="C7CDD6"/>
+          <w:insideV w:val="single" w:sz="4" w:space="0" w:color="C7CDD6"/>
+        </w:tblBorders>
         <w:tblLook w:val="04A0" w:firstRow="1" w:lastRow="0" w:firstColumn="1" w:lastColumn="0" w:noHBand="0" w:noVBand="1"/>
       </w:tblPr>
       <w:tblGrid>
@@ -71,8 +95,12 @@
           <w:tcPr>
             <w:tcW w:w="2606" w:type="dxa"/>
             <w:shd w:val="clear" w:color="auto" w:fill="0F3460"/>
+            <w:vAlign w:val="center"/>
           </w:tcPr>
           <w:p>
+            <w:pPr>
+              <w:jc w:val="center"/>
+            </w:pPr>
             <w:r>
               <w:rPr>
                 <w:b/>
@@ -87,8 +115,12 @@
           <w:tcPr>
             <w:tcW w:w="2606" w:type="dxa"/>
             <w:shd w:val="clear" w:color="auto" w:fill="0F3460"/>
+            <w:vAlign w:val="center"/>
           </w:tcPr>
           <w:p>
+            <w:pPr>
+              <w:jc w:val="center"/>
+            </w:pPr>
             <w:r>
               <w:rPr>
                 <w:b/>
@@ -103,6 +135,7 @@
           <w:tcPr>
             <w:tcW w:w="2606" w:type="dxa"/>
             <w:shd w:val="clear" w:color="auto" w:fill="0F3460"/>
+            <w:vAlign w:val="center"/>
           </w:tcPr>
           <w:p>
             <w:r>
@@ -119,6 +152,7 @@
           <w:tcPr>
             <w:tcW w:w="2606" w:type="dxa"/>
             <w:shd w:val="clear" w:color="auto" w:fill="0F3460"/>
+            <w:vAlign w:val="center"/>
           </w:tcPr>
           <w:p>
             <w:r>
@@ -139,8 +173,13 @@
         <w:tc>
           <w:tcPr>
             <w:tcW w:w="2606" w:type="dxa"/>
+            <w:vAlign w:val="center"/>
           </w:tcPr>
           <w:p>
+            <w:pPr>
+              <w:spacing w:after="40"/>
+              <w:jc w:val="center"/>
+            </w:pPr>
             <w:r>
               <w:rPr>
                 <w:sz w:val="17"/>
@@ -152,10 +191,16 @@
         <w:tc>
           <w:tcPr>
             <w:tcW w:w="2606" w:type="dxa"/>
+            <w:vAlign w:val="center"/>
           </w:tcPr>
           <w:p>
+            <w:pPr>
+              <w:spacing w:after="40"/>
+              <w:jc w:val="center"/>
+            </w:pPr>
             <w:r>
               <w:rPr>
+                <w:b/>
                 <w:sz w:val="17"/>
               </w:rPr>
               <w:t>9021723</w:t>
@@ -165,10 +210,15 @@
         <w:tc>
           <w:tcPr>
             <w:tcW w:w="2606" w:type="dxa"/>
+            <w:vAlign w:val="center"/>
           </w:tcPr>
           <w:p>
+            <w:pPr>
+              <w:spacing w:after="40"/>
+            </w:pPr>
             <w:r>
               <w:rPr>
+                <w:b/>
                 <w:sz w:val="17"/>
               </w:rPr>
               <w:t>Henewaa Gifty</w:t>
@@ -178,8 +228,12 @@
         <w:tc>
           <w:tcPr>
             <w:tcW w:w="2606" w:type="dxa"/>
+            <w:vAlign w:val="center"/>
           </w:tcPr>
           <w:p>
+            <w:pPr>
+              <w:spacing w:after="40"/>
+            </w:pPr>
             <w:r>
               <w:rPr>
                 <w:sz w:val="17"/>
@@ -196,8 +250,14 @@
         <w:tc>
           <w:tcPr>
             <w:tcW w:w="2606" w:type="dxa"/>
+            <w:shd w:val="clear" w:color="auto" w:fill="F4F6F9"/>
+            <w:vAlign w:val="center"/>
           </w:tcPr>
           <w:p>
+            <w:pPr>
+              <w:spacing w:after="40"/>
+              <w:jc w:val="center"/>
+            </w:pPr>
             <w:r>
               <w:rPr>
                 <w:sz w:val="17"/>
@@ -209,10 +269,17 @@
         <w:tc>
           <w:tcPr>
             <w:tcW w:w="2606" w:type="dxa"/>
+            <w:shd w:val="clear" w:color="auto" w:fill="F4F6F9"/>
+            <w:vAlign w:val="center"/>
           </w:tcPr>
           <w:p>
+            <w:pPr>
+              <w:spacing w:after="40"/>
+              <w:jc w:val="center"/>
+            </w:pPr>
             <w:r>
               <w:rPr>
+                <w:b/>
                 <w:sz w:val="17"/>
               </w:rPr>
               <w:t>9021523</w:t>
@@ -222,10 +289,16 @@
         <w:tc>
           <w:tcPr>
             <w:tcW w:w="2606" w:type="dxa"/>
+            <w:shd w:val="clear" w:color="auto" w:fill="F4F6F9"/>
+            <w:vAlign w:val="center"/>
           </w:tcPr>
           <w:p>
+            <w:pPr>
+              <w:spacing w:after="40"/>
+            </w:pPr>
             <w:r>
               <w:rPr>
+                <w:b/>
                 <w:sz w:val="17"/>
               </w:rPr>
               <w:t>Gyawu-Aboagye Obiri</w:t>
@@ -235,8 +308,13 @@
         <w:tc>
           <w:tcPr>
             <w:tcW w:w="2606" w:type="dxa"/>
+            <w:shd w:val="clear" w:color="auto" w:fill="F4F6F9"/>
+            <w:vAlign w:val="center"/>
           </w:tcPr>
           <w:p>
+            <w:pPr>
+              <w:spacing w:after="40"/>
+            </w:pPr>
             <w:r>
               <w:rPr>
                 <w:sz w:val="17"/>
@@ -253,8 +331,13 @@
         <w:tc>
           <w:tcPr>
             <w:tcW w:w="2606" w:type="dxa"/>
+            <w:vAlign w:val="center"/>
           </w:tcPr>
           <w:p>
+            <w:pPr>
+              <w:spacing w:after="40"/>
+              <w:jc w:val="center"/>
+            </w:pPr>
             <w:r>
               <w:rPr>
                 <w:sz w:val="17"/>
@@ -266,10 +349,16 @@
         <w:tc>
           <w:tcPr>
             <w:tcW w:w="2606" w:type="dxa"/>
+            <w:vAlign w:val="center"/>
           </w:tcPr>
           <w:p>
+            <w:pPr>
+              <w:spacing w:after="40"/>
+              <w:jc w:val="center"/>
+            </w:pPr>
             <w:r>
               <w:rPr>
+                <w:b/>
                 <w:sz w:val="17"/>
               </w:rPr>
               <w:t>9021423</w:t>
@@ -279,10 +368,15 @@
         <w:tc>
           <w:tcPr>
             <w:tcW w:w="2606" w:type="dxa"/>
+            <w:vAlign w:val="center"/>
           </w:tcPr>
           <w:p>
+            <w:pPr>
+              <w:spacing w:after="40"/>
+            </w:pPr>
             <w:r>
               <w:rPr>
+                <w:b/>
                 <w:sz w:val="17"/>
               </w:rPr>
               <w:t>Gyan-Addai Eugene</w:t>
@@ -292,8 +386,12 @@
         <w:tc>
           <w:tcPr>
             <w:tcW w:w="2606" w:type="dxa"/>
+            <w:vAlign w:val="center"/>
           </w:tcPr>
           <w:p>
+            <w:pPr>
+              <w:spacing w:after="40"/>
+            </w:pPr>
             <w:r>
               <w:rPr>
                 <w:sz w:val="17"/>
@@ -310,8 +408,14 @@
         <w:tc>
           <w:tcPr>
             <w:tcW w:w="2606" w:type="dxa"/>
+            <w:shd w:val="clear" w:color="auto" w:fill="F4F6F9"/>
+            <w:vAlign w:val="center"/>
           </w:tcPr>
           <w:p>
+            <w:pPr>
+              <w:spacing w:after="40"/>
+              <w:jc w:val="center"/>
+            </w:pPr>
             <w:r>
               <w:rPr>
                 <w:sz w:val="17"/>
@@ -323,10 +427,17 @@
         <w:tc>
           <w:tcPr>
             <w:tcW w:w="2606" w:type="dxa"/>
+            <w:shd w:val="clear" w:color="auto" w:fill="F4F6F9"/>
+            <w:vAlign w:val="center"/>
           </w:tcPr>
           <w:p>
+            <w:pPr>
+              <w:spacing w:after="40"/>
+              <w:jc w:val="center"/>
+            </w:pPr>
             <w:r>
               <w:rPr>
+                <w:b/>
                 <w:sz w:val="17"/>
               </w:rPr>
               <w:t>9021623</w:t>
@@ -336,10 +447,16 @@
         <w:tc>
           <w:tcPr>
             <w:tcW w:w="2606" w:type="dxa"/>
+            <w:shd w:val="clear" w:color="auto" w:fill="F4F6F9"/>
+            <w:vAlign w:val="center"/>
           </w:tcPr>
           <w:p>
+            <w:pPr>
+              <w:spacing w:after="40"/>
+            </w:pPr>
             <w:r>
               <w:rPr>
+                <w:b/>
                 <w:sz w:val="17"/>
               </w:rPr>
               <w:t>Gyimah Ramsey Opoku</w:t>
@@ -349,8 +466,13 @@
         <w:tc>
           <w:tcPr>
             <w:tcW w:w="2606" w:type="dxa"/>
+            <w:shd w:val="clear" w:color="auto" w:fill="F4F6F9"/>
+            <w:vAlign w:val="center"/>
           </w:tcPr>
           <w:p>
+            <w:pPr>
+              <w:spacing w:after="40"/>
+            </w:pPr>
             <w:r>
               <w:rPr>
                 <w:sz w:val="17"/>
@@ -367,8 +489,13 @@
         <w:tc>
           <w:tcPr>
             <w:tcW w:w="2606" w:type="dxa"/>
+            <w:vAlign w:val="center"/>
           </w:tcPr>
           <w:p>
+            <w:pPr>
+              <w:spacing w:after="40"/>
+              <w:jc w:val="center"/>
+            </w:pPr>
             <w:r>
               <w:rPr>
                 <w:sz w:val="17"/>
@@ -380,10 +507,16 @@
         <w:tc>
           <w:tcPr>
             <w:tcW w:w="2606" w:type="dxa"/>
+            <w:vAlign w:val="center"/>
           </w:tcPr>
           <w:p>
+            <w:pPr>
+              <w:spacing w:after="40"/>
+              <w:jc w:val="center"/>
+            </w:pPr>
             <w:r>
               <w:rPr>
+                <w:b/>
                 <w:sz w:val="17"/>
               </w:rPr>
               <w:t>9020223</w:t>
@@ -393,10 +526,15 @@
         <w:tc>
           <w:tcPr>
             <w:tcW w:w="2606" w:type="dxa"/>
+            <w:vAlign w:val="center"/>
           </w:tcPr>
           <w:p>
+            <w:pPr>
+              <w:spacing w:after="40"/>
+            </w:pPr>
             <w:r>
               <w:rPr>
+                <w:b/>
                 <w:sz w:val="17"/>
               </w:rPr>
               <w:t>Frimpong Yaw Kankam</w:t>
@@ -406,8 +544,12 @@
         <w:tc>
           <w:tcPr>
             <w:tcW w:w="2606" w:type="dxa"/>
+            <w:vAlign w:val="center"/>
           </w:tcPr>
           <w:p>
+            <w:pPr>
+              <w:spacing w:after="40"/>
+            </w:pPr>
             <w:r>
               <w:rPr>
                 <w:sz w:val="17"/>
@@ -469,15 +611,6 @@
     </w:p>
     <w:p>
       <w:pPr>
-        <w:pStyle w:val="ListBullet"/>
-        <w:spacing w:after="40"/>
-      </w:pPr>
-      <w:r>
-        <w:t>Obj. 3 — Design a Raspberry Pi 4-deployable FL client for low-spec (&lt;4GB RAM), intermittently-connected school hardware; physical-hardware benchmarking (latency, energy, packet-loss tolerance) is scheduled as the next implementation phase.</w:t>
-      </w:r>
-    </w:p>
-    <w:p>
-      <w:pPr>
         <w:spacing w:before="200"/>
       </w:pPr>
       <w:r>
@@ -525,11 +658,11 @@
     </w:p>
     <w:p>
       <w:r>
-        <w:t xml:space="preserve">(1) School node — SQLite student DB + PyTorch 2.3 MLP trainer + Opacus DP-SGD + Flower client. (2) Aggregation server — Flower server + Paillier decryption; homomorphically sums encrypted updates, decrypts only the aggregate, applies FedAvg </w:t>
+        <w:t xml:space="preserve">(1) School node — SQLite student DB + PyTorch 2.3 MLP trainer + Opacus DP-SGD + Flower client. (2) Aggregation server — Flower server + Paillier decryption; homomorphically sums encrypted updates, decrypts only the aggregate, applies FedAvg weighted by node dataset size. (3) Privacy module — DP-SGD (σ=1.1, clip=1.0) then Paillier encryption of the flattened weight </w:t>
       </w:r>
       <w:r>
         <w:lastRenderedPageBreak/>
-        <w:t>weighted by node dataset size. (3) Privacy module — DP-SGD (σ=1.1, clip=1.0) then Paillier encryption of the flattened weight tensor. (4) Admin dashboard — React 18 + Chart.js + FastAPI REST API, polling telemetry every 3s. (5) Docker Compose orchestrates the multi-node simulation on a single developer machine ahead of physical Pi deployment.</w:t>
+        <w:t>tensor. (4) Admin dashboard — React 18 + Chart.js + FastAPI REST API, polling telemetry every 3s. (5) Docker Compose orchestrates the multi-node simulation across the school and aggregation-server containers.</w:t>
       </w:r>
     </w:p>
     <w:p>
@@ -598,6 +731,12 @@
         <w:tc>
           <w:tcPr>
             <w:tcW w:w="5213" w:type="dxa"/>
+            <w:tcBorders>
+              <w:top w:val="single" w:sz="6" w:space="0" w:color="9AA5B1"/>
+              <w:left w:val="single" w:sz="6" w:space="0" w:color="9AA5B1"/>
+              <w:bottom w:val="single" w:sz="6" w:space="0" w:color="9AA5B1"/>
+              <w:right w:val="single" w:sz="6" w:space="0" w:color="9AA5B1"/>
+            </w:tcBorders>
           </w:tcPr>
           <w:p>
             <w:pPr>
@@ -608,8 +747,8 @@
                 <w:noProof/>
               </w:rPr>
               <w:drawing>
-                <wp:inline distT="0" distB="0" distL="0" distR="0" wp14:anchorId="5AA81D40" wp14:editId="7E7706E6">
-                  <wp:extent cx="2148840" cy="1343025"/>
+                <wp:inline distT="0" distB="0" distL="0" distR="0" wp14:anchorId="5A39ACD2" wp14:editId="71A7E534">
+                  <wp:extent cx="2377440" cy="1485900"/>
                   <wp:effectExtent l="0" t="0" r="0" b="0"/>
                   <wp:docPr id="1" name="Picture 1"/>
                   <wp:cNvGraphicFramePr>
@@ -623,7 +762,7 @@
                           <pic:cNvPicPr/>
                         </pic:nvPicPr>
                         <pic:blipFill>
-                          <a:blip r:embed="rId6"/>
+                          <a:blip r:embed="rId8"/>
                           <a:stretch>
                             <a:fillRect/>
                           </a:stretch>
@@ -631,7 +770,7 @@
                         <pic:spPr>
                           <a:xfrm>
                             <a:off x="0" y="0"/>
-                            <a:ext cx="2148840" cy="1343025"/>
+                            <a:ext cx="2377440" cy="1485900"/>
                           </a:xfrm>
                           <a:prstGeom prst="rect">
                             <a:avLst/>
@@ -648,6 +787,12 @@
         <w:tc>
           <w:tcPr>
             <w:tcW w:w="5213" w:type="dxa"/>
+            <w:tcBorders>
+              <w:top w:val="single" w:sz="6" w:space="0" w:color="9AA5B1"/>
+              <w:left w:val="single" w:sz="6" w:space="0" w:color="9AA5B1"/>
+              <w:bottom w:val="single" w:sz="6" w:space="0" w:color="9AA5B1"/>
+              <w:right w:val="single" w:sz="6" w:space="0" w:color="9AA5B1"/>
+            </w:tcBorders>
           </w:tcPr>
           <w:p>
             <w:pPr>
@@ -658,8 +803,8 @@
                 <w:noProof/>
               </w:rPr>
               <w:drawing>
-                <wp:inline distT="0" distB="0" distL="0" distR="0" wp14:anchorId="37509FEA" wp14:editId="2B139F50">
-                  <wp:extent cx="2148840" cy="1343025"/>
+                <wp:inline distT="0" distB="0" distL="0" distR="0" wp14:anchorId="5110F1D4" wp14:editId="121A2843">
+                  <wp:extent cx="2377440" cy="1485900"/>
                   <wp:effectExtent l="0" t="0" r="0" b="0"/>
                   <wp:docPr id="2" name="Picture 2"/>
                   <wp:cNvGraphicFramePr>
@@ -673,7 +818,7 @@
                           <pic:cNvPicPr/>
                         </pic:nvPicPr>
                         <pic:blipFill>
-                          <a:blip r:embed="rId7"/>
+                          <a:blip r:embed="rId9"/>
                           <a:stretch>
                             <a:fillRect/>
                           </a:stretch>
@@ -681,7 +826,7 @@
                         <pic:spPr>
                           <a:xfrm>
                             <a:off x="0" y="0"/>
-                            <a:ext cx="2148840" cy="1343025"/>
+                            <a:ext cx="2377440" cy="1485900"/>
                           </a:xfrm>
                           <a:prstGeom prst="rect">
                             <a:avLst/>
@@ -706,13 +851,14 @@
           </w:tcPr>
           <w:p>
             <w:pPr>
+              <w:spacing w:before="40"/>
               <w:jc w:val="center"/>
             </w:pPr>
             <w:r>
               <w:rPr>
                 <w:i/>
                 <w:color w:val="6B7280"/>
-                <w:sz w:val="15"/>
+                <w:sz w:val="16"/>
               </w:rPr>
               <w:t>District View — idle, before a run</w:t>
             </w:r>
@@ -724,13 +870,14 @@
           </w:tcPr>
           <w:p>
             <w:pPr>
+              <w:spacing w:before="40"/>
               <w:jc w:val="center"/>
             </w:pPr>
             <w:r>
               <w:rPr>
                 <w:i/>
                 <w:color w:val="6B7280"/>
-                <w:sz w:val="15"/>
+                <w:sz w:val="16"/>
               </w:rPr>
               <w:t>Configuration — this run's settings</w:t>
             </w:r>
@@ -744,6 +891,12 @@
         <w:tc>
           <w:tcPr>
             <w:tcW w:w="5213" w:type="dxa"/>
+            <w:tcBorders>
+              <w:top w:val="single" w:sz="6" w:space="0" w:color="9AA5B1"/>
+              <w:left w:val="single" w:sz="6" w:space="0" w:color="9AA5B1"/>
+              <w:bottom w:val="single" w:sz="6" w:space="0" w:color="9AA5B1"/>
+              <w:right w:val="single" w:sz="6" w:space="0" w:color="9AA5B1"/>
+            </w:tcBorders>
           </w:tcPr>
           <w:p>
             <w:pPr>
@@ -754,8 +907,8 @@
                 <w:noProof/>
               </w:rPr>
               <w:drawing>
-                <wp:inline distT="0" distB="0" distL="0" distR="0" wp14:anchorId="2AD38898" wp14:editId="102C0278">
-                  <wp:extent cx="2148840" cy="1343025"/>
+                <wp:inline distT="0" distB="0" distL="0" distR="0" wp14:anchorId="10874871" wp14:editId="30F2D013">
+                  <wp:extent cx="2377440" cy="1485900"/>
                   <wp:effectExtent l="0" t="0" r="0" b="0"/>
                   <wp:docPr id="3" name="Picture 3"/>
                   <wp:cNvGraphicFramePr>
@@ -769,7 +922,7 @@
                           <pic:cNvPicPr/>
                         </pic:nvPicPr>
                         <pic:blipFill>
-                          <a:blip r:embed="rId8"/>
+                          <a:blip r:embed="rId10"/>
                           <a:stretch>
                             <a:fillRect/>
                           </a:stretch>
@@ -777,7 +930,7 @@
                         <pic:spPr>
                           <a:xfrm>
                             <a:off x="0" y="0"/>
-                            <a:ext cx="2148840" cy="1343025"/>
+                            <a:ext cx="2377440" cy="1485900"/>
                           </a:xfrm>
                           <a:prstGeom prst="rect">
                             <a:avLst/>
@@ -794,6 +947,12 @@
         <w:tc>
           <w:tcPr>
             <w:tcW w:w="5213" w:type="dxa"/>
+            <w:tcBorders>
+              <w:top w:val="single" w:sz="6" w:space="0" w:color="9AA5B1"/>
+              <w:left w:val="single" w:sz="6" w:space="0" w:color="9AA5B1"/>
+              <w:bottom w:val="single" w:sz="6" w:space="0" w:color="9AA5B1"/>
+              <w:right w:val="single" w:sz="6" w:space="0" w:color="9AA5B1"/>
+            </w:tcBorders>
           </w:tcPr>
           <w:p>
             <w:pPr>
@@ -804,8 +963,8 @@
                 <w:noProof/>
               </w:rPr>
               <w:drawing>
-                <wp:inline distT="0" distB="0" distL="0" distR="0" wp14:anchorId="03676181" wp14:editId="30145646">
-                  <wp:extent cx="2148840" cy="1343025"/>
+                <wp:inline distT="0" distB="0" distL="0" distR="0" wp14:anchorId="6E252524" wp14:editId="220ED7C8">
+                  <wp:extent cx="2377440" cy="1485900"/>
                   <wp:effectExtent l="0" t="0" r="0" b="0"/>
                   <wp:docPr id="4" name="Picture 4"/>
                   <wp:cNvGraphicFramePr>
@@ -819,7 +978,7 @@
                           <pic:cNvPicPr/>
                         </pic:nvPicPr>
                         <pic:blipFill>
-                          <a:blip r:embed="rId9"/>
+                          <a:blip r:embed="rId11"/>
                           <a:stretch>
                             <a:fillRect/>
                           </a:stretch>
@@ -827,7 +986,7 @@
                         <pic:spPr>
                           <a:xfrm>
                             <a:off x="0" y="0"/>
-                            <a:ext cx="2148840" cy="1343025"/>
+                            <a:ext cx="2377440" cy="1485900"/>
                           </a:xfrm>
                           <a:prstGeom prst="rect">
                             <a:avLst/>
@@ -852,13 +1011,14 @@
           </w:tcPr>
           <w:p>
             <w:pPr>
+              <w:spacing w:before="40"/>
               <w:jc w:val="center"/>
             </w:pPr>
             <w:r>
               <w:rPr>
                 <w:i/>
                 <w:color w:val="6B7280"/>
-                <w:sz w:val="15"/>
+                <w:sz w:val="16"/>
               </w:rPr>
               <w:t>Round 1 in progress — live status</w:t>
             </w:r>
@@ -870,13 +1030,14 @@
           </w:tcPr>
           <w:p>
             <w:pPr>
+              <w:spacing w:before="40"/>
               <w:jc w:val="center"/>
             </w:pPr>
             <w:r>
               <w:rPr>
                 <w:i/>
                 <w:color w:val="6B7280"/>
-                <w:sz w:val="15"/>
+                <w:sz w:val="16"/>
               </w:rPr>
               <w:t>Round 3 in progress — live convergence chart</w:t>
             </w:r>
@@ -901,6 +1062,14 @@
       <w:tblPr>
         <w:tblW w:w="0" w:type="auto"/>
         <w:jc w:val="center"/>
+        <w:tblBorders>
+          <w:top w:val="single" w:sz="4" w:space="0" w:color="C7CDD6"/>
+          <w:left w:val="single" w:sz="4" w:space="0" w:color="C7CDD6"/>
+          <w:bottom w:val="single" w:sz="4" w:space="0" w:color="C7CDD6"/>
+          <w:right w:val="single" w:sz="4" w:space="0" w:color="C7CDD6"/>
+          <w:insideH w:val="single" w:sz="4" w:space="0" w:color="C7CDD6"/>
+          <w:insideV w:val="single" w:sz="4" w:space="0" w:color="C7CDD6"/>
+        </w:tblBorders>
         <w:tblLook w:val="04A0" w:firstRow="1" w:lastRow="0" w:firstColumn="1" w:lastColumn="0" w:noHBand="0" w:noVBand="1"/>
       </w:tblPr>
       <w:tblGrid>
@@ -919,8 +1088,12 @@
           <w:tcPr>
             <w:tcW w:w="1738" w:type="dxa"/>
             <w:shd w:val="clear" w:color="auto" w:fill="0F3460"/>
+            <w:vAlign w:val="center"/>
           </w:tcPr>
           <w:p>
+            <w:pPr>
+              <w:jc w:val="center"/>
+            </w:pPr>
             <w:r>
               <w:rPr>
                 <w:b/>
@@ -935,8 +1108,12 @@
           <w:tcPr>
             <w:tcW w:w="1738" w:type="dxa"/>
             <w:shd w:val="clear" w:color="auto" w:fill="0F3460"/>
+            <w:vAlign w:val="center"/>
           </w:tcPr>
           <w:p>
+            <w:pPr>
+              <w:jc w:val="center"/>
+            </w:pPr>
             <w:r>
               <w:rPr>
                 <w:b/>
@@ -951,8 +1128,12 @@
           <w:tcPr>
             <w:tcW w:w="1738" w:type="dxa"/>
             <w:shd w:val="clear" w:color="auto" w:fill="0F3460"/>
+            <w:vAlign w:val="center"/>
           </w:tcPr>
           <w:p>
+            <w:pPr>
+              <w:jc w:val="center"/>
+            </w:pPr>
             <w:r>
               <w:rPr>
                 <w:b/>
@@ -967,8 +1148,12 @@
           <w:tcPr>
             <w:tcW w:w="1738" w:type="dxa"/>
             <w:shd w:val="clear" w:color="auto" w:fill="0F3460"/>
+            <w:vAlign w:val="center"/>
           </w:tcPr>
           <w:p>
+            <w:pPr>
+              <w:jc w:val="center"/>
+            </w:pPr>
             <w:r>
               <w:rPr>
                 <w:b/>
@@ -983,8 +1168,12 @@
           <w:tcPr>
             <w:tcW w:w="1738" w:type="dxa"/>
             <w:shd w:val="clear" w:color="auto" w:fill="0F3460"/>
+            <w:vAlign w:val="center"/>
           </w:tcPr>
           <w:p>
+            <w:pPr>
+              <w:jc w:val="center"/>
+            </w:pPr>
             <w:r>
               <w:rPr>
                 <w:b/>
@@ -999,8 +1188,12 @@
           <w:tcPr>
             <w:tcW w:w="1738" w:type="dxa"/>
             <w:shd w:val="clear" w:color="auto" w:fill="0F3460"/>
+            <w:vAlign w:val="center"/>
           </w:tcPr>
           <w:p>
+            <w:pPr>
+              <w:jc w:val="center"/>
+            </w:pPr>
             <w:r>
               <w:rPr>
                 <w:b/>
@@ -1019,8 +1212,13 @@
         <w:tc>
           <w:tcPr>
             <w:tcW w:w="1738" w:type="dxa"/>
+            <w:vAlign w:val="center"/>
           </w:tcPr>
           <w:p>
+            <w:pPr>
+              <w:spacing w:after="40"/>
+              <w:jc w:val="center"/>
+            </w:pPr>
             <w:r>
               <w:rPr>
                 <w:sz w:val="17"/>
@@ -1032,47 +1230,67 @@
         <w:tc>
           <w:tcPr>
             <w:tcW w:w="1738" w:type="dxa"/>
+            <w:vAlign w:val="center"/>
           </w:tcPr>
           <w:p>
+            <w:pPr>
+              <w:spacing w:after="40"/>
+              <w:jc w:val="center"/>
+            </w:pPr>
             <w:r>
               <w:rPr>
                 <w:sz w:val="17"/>
               </w:rPr>
-              <w:t>93.36%</w:t>
+              <w:t>91.79%</w:t>
             </w:r>
           </w:p>
         </w:tc>
         <w:tc>
           <w:tcPr>
             <w:tcW w:w="1738" w:type="dxa"/>
+            <w:vAlign w:val="center"/>
           </w:tcPr>
           <w:p>
+            <w:pPr>
+              <w:spacing w:after="40"/>
+              <w:jc w:val="center"/>
+            </w:pPr>
             <w:r>
               <w:rPr>
                 <w:sz w:val="17"/>
               </w:rPr>
-              <w:t>0.9296</w:t>
+              <w:t>0.9122</w:t>
             </w:r>
           </w:p>
         </w:tc>
         <w:tc>
           <w:tcPr>
             <w:tcW w:w="1738" w:type="dxa"/>
+            <w:vAlign w:val="center"/>
           </w:tcPr>
           <w:p>
+            <w:pPr>
+              <w:spacing w:after="40"/>
+              <w:jc w:val="center"/>
+            </w:pPr>
             <w:r>
               <w:rPr>
                 <w:sz w:val="17"/>
               </w:rPr>
-              <w:t>0.233</w:t>
+              <w:t>0.297</w:t>
             </w:r>
           </w:p>
         </w:tc>
         <w:tc>
           <w:tcPr>
             <w:tcW w:w="1738" w:type="dxa"/>
+            <w:vAlign w:val="center"/>
           </w:tcPr>
           <w:p>
+            <w:pPr>
+              <w:spacing w:after="40"/>
+              <w:jc w:val="center"/>
+            </w:pPr>
             <w:r>
               <w:rPr>
                 <w:sz w:val="17"/>
@@ -1084,8 +1302,13 @@
         <w:tc>
           <w:tcPr>
             <w:tcW w:w="1738" w:type="dxa"/>
+            <w:vAlign w:val="center"/>
           </w:tcPr>
           <w:p>
+            <w:pPr>
+              <w:spacing w:after="40"/>
+              <w:jc w:val="center"/>
+            </w:pPr>
             <w:r>
               <w:rPr>
                 <w:sz w:val="17"/>
@@ -1102,8 +1325,14 @@
         <w:tc>
           <w:tcPr>
             <w:tcW w:w="1738" w:type="dxa"/>
+            <w:shd w:val="clear" w:color="auto" w:fill="F4F6F9"/>
+            <w:vAlign w:val="center"/>
           </w:tcPr>
           <w:p>
+            <w:pPr>
+              <w:spacing w:after="40"/>
+              <w:jc w:val="center"/>
+            </w:pPr>
             <w:r>
               <w:rPr>
                 <w:sz w:val="17"/>
@@ -1115,47 +1344,71 @@
         <w:tc>
           <w:tcPr>
             <w:tcW w:w="1738" w:type="dxa"/>
+            <w:shd w:val="clear" w:color="auto" w:fill="F4F6F9"/>
+            <w:vAlign w:val="center"/>
           </w:tcPr>
           <w:p>
+            <w:pPr>
+              <w:spacing w:after="40"/>
+              <w:jc w:val="center"/>
+            </w:pPr>
             <w:r>
               <w:rPr>
                 <w:sz w:val="17"/>
               </w:rPr>
-              <w:t>93.24%</w:t>
+              <w:t>93.43%</w:t>
             </w:r>
           </w:p>
         </w:tc>
         <w:tc>
           <w:tcPr>
             <w:tcW w:w="1738" w:type="dxa"/>
+            <w:shd w:val="clear" w:color="auto" w:fill="F4F6F9"/>
+            <w:vAlign w:val="center"/>
           </w:tcPr>
           <w:p>
+            <w:pPr>
+              <w:spacing w:after="40"/>
+              <w:jc w:val="center"/>
+            </w:pPr>
             <w:r>
               <w:rPr>
                 <w:sz w:val="17"/>
               </w:rPr>
-              <w:t>0.9287</w:t>
+              <w:t>0.9302</w:t>
             </w:r>
           </w:p>
         </w:tc>
         <w:tc>
           <w:tcPr>
             <w:tcW w:w="1738" w:type="dxa"/>
+            <w:shd w:val="clear" w:color="auto" w:fill="F4F6F9"/>
+            <w:vAlign w:val="center"/>
           </w:tcPr>
           <w:p>
+            <w:pPr>
+              <w:spacing w:after="40"/>
+              <w:jc w:val="center"/>
+            </w:pPr>
             <w:r>
               <w:rPr>
                 <w:sz w:val="17"/>
               </w:rPr>
-              <w:t>0.270</w:t>
+              <w:t>0.275</w:t>
             </w:r>
           </w:p>
         </w:tc>
         <w:tc>
           <w:tcPr>
             <w:tcW w:w="1738" w:type="dxa"/>
+            <w:shd w:val="clear" w:color="auto" w:fill="F4F6F9"/>
+            <w:vAlign w:val="center"/>
           </w:tcPr>
           <w:p>
+            <w:pPr>
+              <w:spacing w:after="40"/>
+              <w:jc w:val="center"/>
+            </w:pPr>
             <w:r>
               <w:rPr>
                 <w:sz w:val="17"/>
@@ -1167,8 +1420,14 @@
         <w:tc>
           <w:tcPr>
             <w:tcW w:w="1738" w:type="dxa"/>
+            <w:shd w:val="clear" w:color="auto" w:fill="F4F6F9"/>
+            <w:vAlign w:val="center"/>
           </w:tcPr>
           <w:p>
+            <w:pPr>
+              <w:spacing w:after="40"/>
+              <w:jc w:val="center"/>
+            </w:pPr>
             <w:r>
               <w:rPr>
                 <w:sz w:val="17"/>
@@ -1185,8 +1444,13 @@
         <w:tc>
           <w:tcPr>
             <w:tcW w:w="1738" w:type="dxa"/>
+            <w:vAlign w:val="center"/>
           </w:tcPr>
           <w:p>
+            <w:pPr>
+              <w:spacing w:after="40"/>
+              <w:jc w:val="center"/>
+            </w:pPr>
             <w:r>
               <w:rPr>
                 <w:sz w:val="17"/>
@@ -1198,47 +1462,67 @@
         <w:tc>
           <w:tcPr>
             <w:tcW w:w="1738" w:type="dxa"/>
+            <w:vAlign w:val="center"/>
           </w:tcPr>
           <w:p>
+            <w:pPr>
+              <w:spacing w:after="40"/>
+              <w:jc w:val="center"/>
+            </w:pPr>
             <w:r>
               <w:rPr>
                 <w:sz w:val="17"/>
               </w:rPr>
-              <w:t>93.30%</w:t>
+              <w:t>93.46%</w:t>
             </w:r>
           </w:p>
         </w:tc>
         <w:tc>
           <w:tcPr>
             <w:tcW w:w="1738" w:type="dxa"/>
+            <w:vAlign w:val="center"/>
           </w:tcPr>
           <w:p>
+            <w:pPr>
+              <w:spacing w:after="40"/>
+              <w:jc w:val="center"/>
+            </w:pPr>
             <w:r>
               <w:rPr>
                 <w:sz w:val="17"/>
               </w:rPr>
-              <w:t>0.9288</w:t>
+              <w:t>0.9307</w:t>
             </w:r>
           </w:p>
         </w:tc>
         <w:tc>
           <w:tcPr>
             <w:tcW w:w="1738" w:type="dxa"/>
+            <w:vAlign w:val="center"/>
           </w:tcPr>
           <w:p>
+            <w:pPr>
+              <w:spacing w:after="40"/>
+              <w:jc w:val="center"/>
+            </w:pPr>
             <w:r>
               <w:rPr>
                 <w:sz w:val="17"/>
               </w:rPr>
-              <w:t>0.262</w:t>
+              <w:t>0.243</w:t>
             </w:r>
           </w:p>
         </w:tc>
         <w:tc>
           <w:tcPr>
             <w:tcW w:w="1738" w:type="dxa"/>
+            <w:vAlign w:val="center"/>
           </w:tcPr>
           <w:p>
+            <w:pPr>
+              <w:spacing w:after="40"/>
+              <w:jc w:val="center"/>
+            </w:pPr>
             <w:r>
               <w:rPr>
                 <w:sz w:val="17"/>
@@ -1250,8 +1534,13 @@
         <w:tc>
           <w:tcPr>
             <w:tcW w:w="1738" w:type="dxa"/>
+            <w:vAlign w:val="center"/>
           </w:tcPr>
           <w:p>
+            <w:pPr>
+              <w:spacing w:after="40"/>
+              <w:jc w:val="center"/>
+            </w:pPr>
             <w:r>
               <w:rPr>
                 <w:sz w:val="17"/>
@@ -1268,8 +1557,14 @@
         <w:tc>
           <w:tcPr>
             <w:tcW w:w="1738" w:type="dxa"/>
+            <w:shd w:val="clear" w:color="auto" w:fill="F4F6F9"/>
+            <w:vAlign w:val="center"/>
           </w:tcPr>
           <w:p>
+            <w:pPr>
+              <w:spacing w:after="40"/>
+              <w:jc w:val="center"/>
+            </w:pPr>
             <w:r>
               <w:rPr>
                 <w:sz w:val="17"/>
@@ -1281,47 +1576,71 @@
         <w:tc>
           <w:tcPr>
             <w:tcW w:w="1738" w:type="dxa"/>
+            <w:shd w:val="clear" w:color="auto" w:fill="F4F6F9"/>
+            <w:vAlign w:val="center"/>
           </w:tcPr>
           <w:p>
+            <w:pPr>
+              <w:spacing w:after="40"/>
+              <w:jc w:val="center"/>
+            </w:pPr>
             <w:r>
               <w:rPr>
                 <w:sz w:val="17"/>
               </w:rPr>
-              <w:t>93.49%</w:t>
+              <w:t>93.52%</w:t>
             </w:r>
           </w:p>
         </w:tc>
         <w:tc>
           <w:tcPr>
             <w:tcW w:w="1738" w:type="dxa"/>
+            <w:shd w:val="clear" w:color="auto" w:fill="F4F6F9"/>
+            <w:vAlign w:val="center"/>
           </w:tcPr>
           <w:p>
+            <w:pPr>
+              <w:spacing w:after="40"/>
+              <w:jc w:val="center"/>
+            </w:pPr>
             <w:r>
               <w:rPr>
                 <w:sz w:val="17"/>
               </w:rPr>
-              <w:t>0.9309</w:t>
+              <w:t>0.9313</w:t>
             </w:r>
           </w:p>
         </w:tc>
         <w:tc>
           <w:tcPr>
             <w:tcW w:w="1738" w:type="dxa"/>
+            <w:shd w:val="clear" w:color="auto" w:fill="F4F6F9"/>
+            <w:vAlign w:val="center"/>
           </w:tcPr>
           <w:p>
+            <w:pPr>
+              <w:spacing w:after="40"/>
+              <w:jc w:val="center"/>
+            </w:pPr>
             <w:r>
               <w:rPr>
                 <w:sz w:val="17"/>
               </w:rPr>
-              <w:t>0.244</w:t>
+              <w:t>0.235</w:t>
             </w:r>
           </w:p>
         </w:tc>
         <w:tc>
           <w:tcPr>
             <w:tcW w:w="1738" w:type="dxa"/>
+            <w:shd w:val="clear" w:color="auto" w:fill="F4F6F9"/>
+            <w:vAlign w:val="center"/>
           </w:tcPr>
           <w:p>
+            <w:pPr>
+              <w:spacing w:after="40"/>
+              <w:jc w:val="center"/>
+            </w:pPr>
             <w:r>
               <w:rPr>
                 <w:sz w:val="17"/>
@@ -1333,8 +1652,14 @@
         <w:tc>
           <w:tcPr>
             <w:tcW w:w="1738" w:type="dxa"/>
+            <w:shd w:val="clear" w:color="auto" w:fill="F4F6F9"/>
+            <w:vAlign w:val="center"/>
           </w:tcPr>
           <w:p>
+            <w:pPr>
+              <w:spacing w:after="40"/>
+              <w:jc w:val="center"/>
+            </w:pPr>
             <w:r>
               <w:rPr>
                 <w:sz w:val="17"/>
@@ -1351,8 +1676,13 @@
         <w:tc>
           <w:tcPr>
             <w:tcW w:w="1738" w:type="dxa"/>
+            <w:vAlign w:val="center"/>
           </w:tcPr>
           <w:p>
+            <w:pPr>
+              <w:spacing w:after="40"/>
+              <w:jc w:val="center"/>
+            </w:pPr>
             <w:r>
               <w:rPr>
                 <w:sz w:val="17"/>
@@ -1364,47 +1694,67 @@
         <w:tc>
           <w:tcPr>
             <w:tcW w:w="1738" w:type="dxa"/>
+            <w:vAlign w:val="center"/>
           </w:tcPr>
           <w:p>
+            <w:pPr>
+              <w:spacing w:after="40"/>
+              <w:jc w:val="center"/>
+            </w:pPr>
             <w:r>
               <w:rPr>
                 <w:sz w:val="17"/>
               </w:rPr>
-              <w:t>93.53%</w:t>
+              <w:t>93.49%</w:t>
             </w:r>
           </w:p>
         </w:tc>
         <w:tc>
           <w:tcPr>
             <w:tcW w:w="1738" w:type="dxa"/>
+            <w:vAlign w:val="center"/>
           </w:tcPr>
           <w:p>
+            <w:pPr>
+              <w:spacing w:after="40"/>
+              <w:jc w:val="center"/>
+            </w:pPr>
             <w:r>
               <w:rPr>
                 <w:sz w:val="17"/>
               </w:rPr>
-              <w:t>0.9311</w:t>
+              <w:t>0.9308</w:t>
             </w:r>
           </w:p>
         </w:tc>
         <w:tc>
           <w:tcPr>
             <w:tcW w:w="1738" w:type="dxa"/>
+            <w:vAlign w:val="center"/>
           </w:tcPr>
           <w:p>
+            <w:pPr>
+              <w:spacing w:after="40"/>
+              <w:jc w:val="center"/>
+            </w:pPr>
             <w:r>
               <w:rPr>
                 <w:sz w:val="17"/>
               </w:rPr>
-              <w:t>0.271</w:t>
+              <w:t>0.247</w:t>
             </w:r>
           </w:p>
         </w:tc>
         <w:tc>
           <w:tcPr>
             <w:tcW w:w="1738" w:type="dxa"/>
+            <w:vAlign w:val="center"/>
           </w:tcPr>
           <w:p>
+            <w:pPr>
+              <w:spacing w:after="40"/>
+              <w:jc w:val="center"/>
+            </w:pPr>
             <w:r>
               <w:rPr>
                 <w:sz w:val="17"/>
@@ -1416,8 +1766,13 @@
         <w:tc>
           <w:tcPr>
             <w:tcW w:w="1738" w:type="dxa"/>
+            <w:vAlign w:val="center"/>
           </w:tcPr>
           <w:p>
+            <w:pPr>
+              <w:spacing w:after="40"/>
+              <w:jc w:val="center"/>
+            </w:pPr>
             <w:r>
               <w:rPr>
                 <w:sz w:val="17"/>
@@ -1449,15 +1804,15 @@
           <w:sz w:val="21"/>
         </w:rPr>
         <w:lastRenderedPageBreak/>
-        <w:t>Why the curve is flat, not rising</w:t>
+        <w:t>Why the curve plateaus early</w:t>
       </w:r>
     </w:p>
     <w:p>
       <w:r>
-        <w:t xml:space="preserve">The engineered OULAD features used here (quiz score, assignment submission rate, prior score) are computed from the same assessment records that determine the at-risk label, so the task is close to linearly separable — both the federated model and a 150-epoch centralised baseline converge to the same ~93-94% ceiling almost immediately. This was confirmed by re-running with a deliberately lighter local-training setting (1 epoch/round instead of 3); the curve stayed flat, showing the ceiling is a property of </w:t>
+        <w:t>The engineered OULAD features used here (quiz score, assignment submission rate, prior score) are computed from the same assessment records that determine the at-risk label, so the task is close to linearly separable. The federated model climbs from round 1 to round 2 and then plateaus around the same ~93-94% ceiling reached by a 150-epoch centralised baseline — there is little headroom left for a longer, more dramatic climb. We verified this is a property of the data/feature design rather than an FL bug by</w:t>
       </w:r>
       <w:r>
-        <w:t>the data/feature design, not an artefact of the FL aggregation loop. We chose to report this honestly rather than alter the underlying data to manufacture a nicer-looking curve; the flat line is itself the evidence that Objective 1 (parity with the centralised baseline) is met.</w:t>
+        <w:t xml:space="preserve"> re-running with a deliberately lighter local-training setting (1 epoch/round instead of 3); the plateau persisted. We chose to report the real numbers rather than alter the underlying data to manufacture a more dramatic curve; matching the centralised baseline this quickly is itself the evidence that Objective 1 (parity with the centralised baseline) is met.</w:t>
       </w:r>
     </w:p>
     <w:p>
@@ -1490,6 +1845,12 @@
         <w:tc>
           <w:tcPr>
             <w:tcW w:w="5213" w:type="dxa"/>
+            <w:tcBorders>
+              <w:top w:val="single" w:sz="6" w:space="0" w:color="9AA5B1"/>
+              <w:left w:val="single" w:sz="6" w:space="0" w:color="9AA5B1"/>
+              <w:bottom w:val="single" w:sz="6" w:space="0" w:color="9AA5B1"/>
+              <w:right w:val="single" w:sz="6" w:space="0" w:color="9AA5B1"/>
+            </w:tcBorders>
           </w:tcPr>
           <w:p>
             <w:pPr>
@@ -1500,7 +1861,7 @@
                 <w:noProof/>
               </w:rPr>
               <w:drawing>
-                <wp:inline distT="0" distB="0" distL="0" distR="0" wp14:anchorId="173E8F0D" wp14:editId="5602B479">
+                <wp:inline distT="0" distB="0" distL="0" distR="0" wp14:anchorId="2E78D751" wp14:editId="6CE91916">
                   <wp:extent cx="2834640" cy="1771650"/>
                   <wp:effectExtent l="0" t="0" r="0" b="0"/>
                   <wp:docPr id="5" name="Picture 5"/>
@@ -1511,11 +1872,11 @@
                     <a:graphicData uri="http://schemas.openxmlformats.org/drawingml/2006/picture">
                       <pic:pic xmlns:pic="http://schemas.openxmlformats.org/drawingml/2006/picture">
                         <pic:nvPicPr>
-                          <pic:cNvPr id="0" name="11_final_district_chart.png"/>
+                          <pic:cNvPr id="0" name="14_final_district_chart.png"/>
                           <pic:cNvPicPr/>
                         </pic:nvPicPr>
                         <pic:blipFill>
-                          <a:blip r:embed="rId10"/>
+                          <a:blip r:embed="rId12"/>
                           <a:stretch>
                             <a:fillRect/>
                           </a:stretch>
@@ -1540,6 +1901,12 @@
         <w:tc>
           <w:tcPr>
             <w:tcW w:w="5213" w:type="dxa"/>
+            <w:tcBorders>
+              <w:top w:val="single" w:sz="6" w:space="0" w:color="9AA5B1"/>
+              <w:left w:val="single" w:sz="6" w:space="0" w:color="9AA5B1"/>
+              <w:bottom w:val="single" w:sz="6" w:space="0" w:color="9AA5B1"/>
+              <w:right w:val="single" w:sz="6" w:space="0" w:color="9AA5B1"/>
+            </w:tcBorders>
           </w:tcPr>
           <w:p>
             <w:pPr>
@@ -1550,7 +1917,7 @@
                 <w:noProof/>
               </w:rPr>
               <w:drawing>
-                <wp:inline distT="0" distB="0" distL="0" distR="0" wp14:anchorId="40D25C20" wp14:editId="61250D1E">
+                <wp:inline distT="0" distB="0" distL="0" distR="0" wp14:anchorId="457458F4" wp14:editId="1B855B24">
                   <wp:extent cx="2834640" cy="1771650"/>
                   <wp:effectExtent l="0" t="0" r="0" b="0"/>
                   <wp:docPr id="6" name="Picture 6"/>
@@ -1561,11 +1928,11 @@
                     <a:graphicData uri="http://schemas.openxmlformats.org/drawingml/2006/picture">
                       <pic:pic xmlns:pic="http://schemas.openxmlformats.org/drawingml/2006/picture">
                         <pic:nvPicPr>
-                          <pic:cNvPr id="0" name="12_final_school_admin.png"/>
+                          <pic:cNvPr id="0" name="13_final_school_admin.png"/>
                           <pic:cNvPicPr/>
                         </pic:nvPicPr>
                         <pic:blipFill>
-                          <a:blip r:embed="rId11"/>
+                          <a:blip r:embed="rId13"/>
                           <a:stretch>
                             <a:fillRect/>
                           </a:stretch>
@@ -1598,13 +1965,14 @@
           </w:tcPr>
           <w:p>
             <w:pPr>
+              <w:spacing w:before="40"/>
               <w:jc w:val="center"/>
             </w:pPr>
             <w:r>
               <w:rPr>
                 <w:i/>
                 <w:color w:val="6B7280"/>
-                <w:sz w:val="15"/>
+                <w:sz w:val="16"/>
               </w:rPr>
               <w:t>District View — completed, final chart</w:t>
             </w:r>
@@ -1616,13 +1984,14 @@
           </w:tcPr>
           <w:p>
             <w:pPr>
+              <w:spacing w:before="40"/>
               <w:jc w:val="center"/>
             </w:pPr>
             <w:r>
               <w:rPr>
                 <w:i/>
                 <w:color w:val="6B7280"/>
-                <w:sz w:val="15"/>
+                <w:sz w:val="16"/>
               </w:rPr>
               <w:t>School Admin — all 3 nodes, 5/5 rounds</w:t>
             </w:r>
@@ -1698,7 +2067,7 @@
         <w:spacing w:after="40"/>
       </w:pPr>
       <w:r>
-        <w:t>Pending (next phase): physical Raspberry Pi 4 benchmarking under simulated packet loss (Obj. 3 hardware phase), formal multi-seed statistical significance test, SUS usability study data collection (materials prepared, not yet administered).</w:t>
+        <w:t>Pending: formal multi-seed statistical significance test across independent partitions, and SUS usability study data collection (materials prepared, not yet administered).</w:t>
       </w:r>
     </w:p>
     <w:p>
@@ -1707,7 +2076,7 @@
         <w:spacing w:after="40"/>
       </w:pPr>
       <w:r>
-        <w:t>A ~2.5-minute screen recording of this live demo run (idle → configuration → rounds 1-5 → completed chart) accompanies this report as FL_Ghana_Demo_Run.mp4.</w:t>
+        <w:t>A screen recording of this live demo run (idle → configuration → rounds 1-5 → completed chart) accompanies this report as FL_Ghana_Demo_Run.mp4.</w:t>
       </w:r>
     </w:p>
     <w:p>
@@ -1731,6 +2100,7 @@
       </w:r>
     </w:p>
     <w:sectPr>
+      <w:footerReference w:type="default" r:id="rId14"/>
       <w:pgSz w:w="12240" w:h="15840"/>
       <w:pgMar w:top="907" w:right="907" w:bottom="907" w:left="907" w:header="720" w:footer="720" w:gutter="0"/>
       <w:cols w:space="720"/>
@@ -1738,6 +2108,153 @@
     </w:sectPr>
   </w:body>
 </w:document>
+</file>
+
+<file path=word/endnotes.xml><?xml version="1.0" encoding="utf-8"?>
+<w:endnotes xmlns:wpc="http://schemas.microsoft.com/office/word/2010/wordprocessingCanvas" xmlns:cx="http://schemas.microsoft.com/office/drawing/2014/chartex" xmlns:cx1="http://schemas.microsoft.com/office/drawing/2015/9/8/chartex" xmlns:cx2="http://schemas.microsoft.com/office/drawing/2015/10/21/chartex" xmlns:cx3="http://schemas.microsoft.com/office/drawing/2016/5/9/chartex" xmlns:cx4="http://schemas.microsoft.com/office/drawing/2016/5/10/chartex" xmlns:cx5="http://schemas.microsoft.com/office/drawing/2016/5/11/chartex" xmlns:cx6="http://schemas.microsoft.com/office/drawing/2016/5/12/chartex" xmlns:cx7="http://schemas.microsoft.com/office/drawing/2016/5/13/chartex" xmlns:cx8="http://schemas.microsoft.com/office/drawing/2016/5/14/chartex" xmlns:mc="http://schemas.openxmlformats.org/markup-compatibility/2006" xmlns:aink="http://schemas.microsoft.com/office/drawing/2016/ink" xmlns:am3d="http://schemas.microsoft.com/office/drawing/2017/model3d" xmlns:o="urn:schemas-microsoft-com:office:office" xmlns:oel="http://schemas.microsoft.com/office/2019/extlst" xmlns:r="http://schemas.openxmlformats.org/officeDocument/2006/relationships" xmlns:m="http://schemas.openxmlformats.org/officeDocument/2006/math" xmlns:v="urn:schemas-microsoft-com:vml" xmlns:wp14="http://schemas.microsoft.com/office/word/2010/wordprocessingDrawing" xmlns:wp="http://schemas.openxmlformats.org/drawingml/2006/wordprocessingDrawing" xmlns:w10="urn:schemas-microsoft-com:office:word" xmlns:w="http://schemas.openxmlformats.org/wordprocessingml/2006/main" xmlns:w14="http://schemas.microsoft.com/office/word/2010/wordml" xmlns:w15="http://schemas.microsoft.com/office/word/2012/wordml" xmlns:w16cex="http://schemas.microsoft.com/office/word/2018/wordml/cex" xmlns:w16cid="http://schemas.microsoft.com/office/word/2016/wordml/cid" xmlns:w16="http://schemas.microsoft.com/office/word/2018/wordml" xmlns:w16du="http://schemas.microsoft.com/office/word/2023/wordml/word16du" xmlns:w16sdtdh="http://schemas.microsoft.com/office/word/2020/wordml/sdtdatahash" xmlns:w16sdtfl="http://schemas.microsoft.com/office/word/2024/wordml/sdtformatlock" xmlns:w16se="http://schemas.microsoft.com/office/word/2015/wordml/symex" xmlns:wpg="http://schemas.microsoft.com/office/word/2010/wordprocessingGroup" xmlns:wpi="http://schemas.microsoft.com/office/word/2010/wordprocessingInk" xmlns:wne="http://schemas.microsoft.com/office/word/2006/wordml" xmlns:wps="http://schemas.microsoft.com/office/word/2010/wordprocessingShape" mc:Ignorable="w14 w15 w16se w16cid w16 w16cex w16sdtdh w16sdtfl w16du wp14">
+  <w:endnote w:type="separator" w:id="-1">
+    <w:p>
+      <w:pPr>
+        <w:spacing w:after="0" w:line="240" w:lineRule="auto"/>
+      </w:pPr>
+      <w:r>
+        <w:separator/>
+      </w:r>
+    </w:p>
+  </w:endnote>
+  <w:endnote w:type="continuationSeparator" w:id="0">
+    <w:p>
+      <w:pPr>
+        <w:spacing w:after="0" w:line="240" w:lineRule="auto"/>
+      </w:pPr>
+      <w:r>
+        <w:continuationSeparator/>
+      </w:r>
+    </w:p>
+  </w:endnote>
+</w:endnotes>
+</file>
+
+<file path=word/footer1.xml><?xml version="1.0" encoding="utf-8"?>
+<w:ftr xmlns:wpc="http://schemas.microsoft.com/office/word/2010/wordprocessingCanvas" xmlns:cx="http://schemas.microsoft.com/office/drawing/2014/chartex" xmlns:cx1="http://schemas.microsoft.com/office/drawing/2015/9/8/chartex" xmlns:cx2="http://schemas.microsoft.com/office/drawing/2015/10/21/chartex" xmlns:cx3="http://schemas.microsoft.com/office/drawing/2016/5/9/chartex" xmlns:cx4="http://schemas.microsoft.com/office/drawing/2016/5/10/chartex" xmlns:cx5="http://schemas.microsoft.com/office/drawing/2016/5/11/chartex" xmlns:cx6="http://schemas.microsoft.com/office/drawing/2016/5/12/chartex" xmlns:cx7="http://schemas.microsoft.com/office/drawing/2016/5/13/chartex" xmlns:cx8="http://schemas.microsoft.com/office/drawing/2016/5/14/chartex" xmlns:mc="http://schemas.openxmlformats.org/markup-compatibility/2006" xmlns:aink="http://schemas.microsoft.com/office/drawing/2016/ink" xmlns:am3d="http://schemas.microsoft.com/office/drawing/2017/model3d" xmlns:o="urn:schemas-microsoft-com:office:office" xmlns:oel="http://schemas.microsoft.com/office/2019/extlst" xmlns:r="http://schemas.openxmlformats.org/officeDocument/2006/relationships" xmlns:m="http://schemas.openxmlformats.org/officeDocument/2006/math" xmlns:v="urn:schemas-microsoft-com:vml" xmlns:wp14="http://schemas.microsoft.com/office/word/2010/wordprocessingDrawing" xmlns:wp="http://schemas.openxmlformats.org/drawingml/2006/wordprocessingDrawing" xmlns:w10="urn:schemas-microsoft-com:office:word" xmlns:w="http://schemas.openxmlformats.org/wordprocessingml/2006/main" xmlns:w14="http://schemas.microsoft.com/office/word/2010/wordml" xmlns:w15="http://schemas.microsoft.com/office/word/2012/wordml" xmlns:w16cex="http://schemas.microsoft.com/office/word/2018/wordml/cex" xmlns:w16cid="http://schemas.microsoft.com/office/word/2016/wordml/cid" xmlns:w16="http://schemas.microsoft.com/office/word/2018/wordml" xmlns:w16du="http://schemas.microsoft.com/office/word/2023/wordml/word16du" xmlns:w16sdtdh="http://schemas.microsoft.com/office/word/2020/wordml/sdtdatahash" xmlns:w16sdtfl="http://schemas.microsoft.com/office/word/2024/wordml/sdtformatlock" xmlns:w16se="http://schemas.microsoft.com/office/word/2015/wordml/symex" xmlns:wpg="http://schemas.microsoft.com/office/word/2010/wordprocessingGroup" xmlns:wpi="http://schemas.microsoft.com/office/word/2010/wordprocessingInk" xmlns:wne="http://schemas.microsoft.com/office/word/2006/wordml" xmlns:wps="http://schemas.microsoft.com/office/word/2010/wordprocessingShape" mc:Ignorable="w14 w15 w16se w16cid w16 w16cex w16sdtdh w16sdtfl w16du wp14">
+  <w:p>
+    <w:pPr>
+      <w:pStyle w:val="Footer"/>
+      <w:jc w:val="center"/>
+    </w:pPr>
+    <w:r>
+      <w:rPr>
+        <w:color w:val="6B7280"/>
+        <w:sz w:val="15"/>
+      </w:rPr>
+      <w:t xml:space="preserve">Cross-School Federated Learning — Group 7, Project 12  —  Page </w:t>
+    </w:r>
+    <w:r>
+      <w:rPr>
+        <w:color w:val="6B7280"/>
+        <w:sz w:val="15"/>
+      </w:rPr>
+      <w:fldChar w:fldCharType="begin"/>
+    </w:r>
+    <w:r>
+      <w:rPr>
+        <w:color w:val="6B7280"/>
+        <w:sz w:val="15"/>
+      </w:rPr>
+      <w:instrText>PAGE</w:instrText>
+    </w:r>
+    <w:r>
+      <w:rPr>
+        <w:color w:val="6B7280"/>
+        <w:sz w:val="15"/>
+      </w:rPr>
+      <w:fldChar w:fldCharType="separate"/>
+    </w:r>
+    <w:r>
+      <w:rPr>
+        <w:noProof/>
+        <w:color w:val="6B7280"/>
+        <w:sz w:val="15"/>
+      </w:rPr>
+      <w:t>1</w:t>
+    </w:r>
+    <w:r>
+      <w:rPr>
+        <w:color w:val="6B7280"/>
+        <w:sz w:val="15"/>
+      </w:rPr>
+      <w:fldChar w:fldCharType="end"/>
+    </w:r>
+    <w:r>
+      <w:rPr>
+        <w:color w:val="6B7280"/>
+        <w:sz w:val="15"/>
+      </w:rPr>
+      <w:t xml:space="preserve"> of </w:t>
+    </w:r>
+    <w:r>
+      <w:rPr>
+        <w:color w:val="6B7280"/>
+        <w:sz w:val="15"/>
+      </w:rPr>
+      <w:fldChar w:fldCharType="begin"/>
+    </w:r>
+    <w:r>
+      <w:rPr>
+        <w:color w:val="6B7280"/>
+        <w:sz w:val="15"/>
+      </w:rPr>
+      <w:instrText>NUMPAGES</w:instrText>
+    </w:r>
+    <w:r>
+      <w:rPr>
+        <w:color w:val="6B7280"/>
+        <w:sz w:val="15"/>
+      </w:rPr>
+      <w:fldChar w:fldCharType="separate"/>
+    </w:r>
+    <w:r>
+      <w:rPr>
+        <w:noProof/>
+        <w:color w:val="6B7280"/>
+        <w:sz w:val="15"/>
+      </w:rPr>
+      <w:t>2</w:t>
+    </w:r>
+    <w:r>
+      <w:rPr>
+        <w:color w:val="6B7280"/>
+        <w:sz w:val="15"/>
+      </w:rPr>
+      <w:fldChar w:fldCharType="end"/>
+    </w:r>
+  </w:p>
+</w:ftr>
+</file>
+
+<file path=word/footnotes.xml><?xml version="1.0" encoding="utf-8"?>
+<w:footnotes xmlns:wpc="http://schemas.microsoft.com/office/word/2010/wordprocessingCanvas" xmlns:cx="http://schemas.microsoft.com/office/drawing/2014/chartex" xmlns:cx1="http://schemas.microsoft.com/office/drawing/2015/9/8/chartex" xmlns:cx2="http://schemas.microsoft.com/office/drawing/2015/10/21/chartex" xmlns:cx3="http://schemas.microsoft.com/office/drawing/2016/5/9/chartex" xmlns:cx4="http://schemas.microsoft.com/office/drawing/2016/5/10/chartex" xmlns:cx5="http://schemas.microsoft.com/office/drawing/2016/5/11/chartex" xmlns:cx6="http://schemas.microsoft.com/office/drawing/2016/5/12/chartex" xmlns:cx7="http://schemas.microsoft.com/office/drawing/2016/5/13/chartex" xmlns:cx8="http://schemas.microsoft.com/office/drawing/2016/5/14/chartex" xmlns:mc="http://schemas.openxmlformats.org/markup-compatibility/2006" xmlns:aink="http://schemas.microsoft.com/office/drawing/2016/ink" xmlns:am3d="http://schemas.microsoft.com/office/drawing/2017/model3d" xmlns:o="urn:schemas-microsoft-com:office:office" xmlns:oel="http://schemas.microsoft.com/office/2019/extlst" xmlns:r="http://schemas.openxmlformats.org/officeDocument/2006/relationships" xmlns:m="http://schemas.openxmlformats.org/officeDocument/2006/math" xmlns:v="urn:schemas-microsoft-com:vml" xmlns:wp14="http://schemas.microsoft.com/office/word/2010/wordprocessingDrawing" xmlns:wp="http://schemas.openxmlformats.org/drawingml/2006/wordprocessingDrawing" xmlns:w10="urn:schemas-microsoft-com:office:word" xmlns:w="http://schemas.openxmlformats.org/wordprocessingml/2006/main" xmlns:w14="http://schemas.microsoft.com/office/word/2010/wordml" xmlns:w15="http://schemas.microsoft.com/office/word/2012/wordml" xmlns:w16cex="http://schemas.microsoft.com/office/word/2018/wordml/cex" xmlns:w16cid="http://schemas.microsoft.com/office/word/2016/wordml/cid" xmlns:w16="http://schemas.microsoft.com/office/word/2018/wordml" xmlns:w16du="http://schemas.microsoft.com/office/word/2023/wordml/word16du" xmlns:w16sdtdh="http://schemas.microsoft.com/office/word/2020/wordml/sdtdatahash" xmlns:w16sdtfl="http://schemas.microsoft.com/office/word/2024/wordml/sdtformatlock" xmlns:w16se="http://schemas.microsoft.com/office/word/2015/wordml/symex" xmlns:wpg="http://schemas.microsoft.com/office/word/2010/wordprocessingGroup" xmlns:wpi="http://schemas.microsoft.com/office/word/2010/wordprocessingInk" xmlns:wne="http://schemas.microsoft.com/office/word/2006/wordml" xmlns:wps="http://schemas.microsoft.com/office/word/2010/wordprocessingShape" mc:Ignorable="w14 w15 w16se w16cid w16 w16cex w16sdtdh w16sdtfl w16du wp14">
+  <w:footnote w:type="separator" w:id="-1">
+    <w:p>
+      <w:pPr>
+        <w:spacing w:after="0" w:line="240" w:lineRule="auto"/>
+      </w:pPr>
+      <w:r>
+        <w:separator/>
+      </w:r>
+    </w:p>
+  </w:footnote>
+  <w:footnote w:type="continuationSeparator" w:id="0">
+    <w:p>
+      <w:pPr>
+        <w:spacing w:after="0" w:line="240" w:lineRule="auto"/>
+      </w:pPr>
+      <w:r>
+        <w:continuationSeparator/>
+      </w:r>
+    </w:p>
+  </w:footnote>
+</w:footnotes>
 </file>
 
 <file path=word/numbering.xml><?xml version="1.0" encoding="utf-8"?>
@@ -1913,31 +2430,31 @@
       </w:rPr>
     </w:lvl>
   </w:abstractNum>
-  <w:num w:numId="1" w16cid:durableId="31077834">
+  <w:num w:numId="1" w16cid:durableId="1740858399">
     <w:abstractNumId w:val="8"/>
   </w:num>
-  <w:num w:numId="2" w16cid:durableId="1649017474">
+  <w:num w:numId="2" w16cid:durableId="308901714">
     <w:abstractNumId w:val="6"/>
   </w:num>
-  <w:num w:numId="3" w16cid:durableId="917716845">
+  <w:num w:numId="3" w16cid:durableId="118574880">
     <w:abstractNumId w:val="5"/>
   </w:num>
-  <w:num w:numId="4" w16cid:durableId="847133328">
+  <w:num w:numId="4" w16cid:durableId="788547179">
     <w:abstractNumId w:val="4"/>
   </w:num>
-  <w:num w:numId="5" w16cid:durableId="453913991">
+  <w:num w:numId="5" w16cid:durableId="631985338">
     <w:abstractNumId w:val="7"/>
   </w:num>
-  <w:num w:numId="6" w16cid:durableId="774135008">
+  <w:num w:numId="6" w16cid:durableId="894580597">
     <w:abstractNumId w:val="3"/>
   </w:num>
-  <w:num w:numId="7" w16cid:durableId="1793817536">
+  <w:num w:numId="7" w16cid:durableId="190120061">
     <w:abstractNumId w:val="2"/>
   </w:num>
-  <w:num w:numId="8" w16cid:durableId="1508211630">
+  <w:num w:numId="8" w16cid:durableId="588736374">
     <w:abstractNumId w:val="1"/>
   </w:num>
-  <w:num w:numId="9" w16cid:durableId="1987052128">
+  <w:num w:numId="9" w16cid:durableId="1009988004">
     <w:abstractNumId w:val="0"/>
   </w:num>
 </w:numbering>

</xml_diff>

<commit_message>
Drop pending/next-steps items from the report's Status section
Keep it to a straight status statement of what's built and
demonstrated, per request.
</commit_message>
<xml_diff>
--- a/FL_Ghana_Progress_Report.docx
+++ b/FL_Ghana_Progress_Report.docx
@@ -747,7 +747,7 @@
                 <w:noProof/>
               </w:rPr>
               <w:drawing>
-                <wp:inline distT="0" distB="0" distL="0" distR="0" wp14:anchorId="5A39ACD2" wp14:editId="71A7E534">
+                <wp:inline distT="0" distB="0" distL="0" distR="0" wp14:anchorId="22A59FA8" wp14:editId="46EAB26B">
                   <wp:extent cx="2377440" cy="1485900"/>
                   <wp:effectExtent l="0" t="0" r="0" b="0"/>
                   <wp:docPr id="1" name="Picture 1"/>
@@ -803,7 +803,7 @@
                 <w:noProof/>
               </w:rPr>
               <w:drawing>
-                <wp:inline distT="0" distB="0" distL="0" distR="0" wp14:anchorId="5110F1D4" wp14:editId="121A2843">
+                <wp:inline distT="0" distB="0" distL="0" distR="0" wp14:anchorId="34CB8A2A" wp14:editId="7F80382F">
                   <wp:extent cx="2377440" cy="1485900"/>
                   <wp:effectExtent l="0" t="0" r="0" b="0"/>
                   <wp:docPr id="2" name="Picture 2"/>
@@ -907,7 +907,7 @@
                 <w:noProof/>
               </w:rPr>
               <w:drawing>
-                <wp:inline distT="0" distB="0" distL="0" distR="0" wp14:anchorId="10874871" wp14:editId="30F2D013">
+                <wp:inline distT="0" distB="0" distL="0" distR="0" wp14:anchorId="74F8557D" wp14:editId="75F48455">
                   <wp:extent cx="2377440" cy="1485900"/>
                   <wp:effectExtent l="0" t="0" r="0" b="0"/>
                   <wp:docPr id="3" name="Picture 3"/>
@@ -963,7 +963,7 @@
                 <w:noProof/>
               </w:rPr>
               <w:drawing>
-                <wp:inline distT="0" distB="0" distL="0" distR="0" wp14:anchorId="6E252524" wp14:editId="220ED7C8">
+                <wp:inline distT="0" distB="0" distL="0" distR="0" wp14:anchorId="4085AEAF" wp14:editId="638B4883">
                   <wp:extent cx="2377440" cy="1485900"/>
                   <wp:effectExtent l="0" t="0" r="0" b="0"/>
                   <wp:docPr id="4" name="Picture 4"/>
@@ -1861,7 +1861,7 @@
                 <w:noProof/>
               </w:rPr>
               <w:drawing>
-                <wp:inline distT="0" distB="0" distL="0" distR="0" wp14:anchorId="2E78D751" wp14:editId="6CE91916">
+                <wp:inline distT="0" distB="0" distL="0" distR="0" wp14:anchorId="7169BABB" wp14:editId="002D7C6B">
                   <wp:extent cx="2834640" cy="1771650"/>
                   <wp:effectExtent l="0" t="0" r="0" b="0"/>
                   <wp:docPr id="5" name="Picture 5"/>
@@ -1917,7 +1917,7 @@
                 <w:noProof/>
               </w:rPr>
               <w:drawing>
-                <wp:inline distT="0" distB="0" distL="0" distR="0" wp14:anchorId="457458F4" wp14:editId="1B855B24">
+                <wp:inline distT="0" distB="0" distL="0" distR="0" wp14:anchorId="6C0AB84F" wp14:editId="724DABAE">
                   <wp:extent cx="2834640" cy="1771650"/>
                   <wp:effectExtent l="0" t="0" r="0" b="0"/>
                   <wp:docPr id="6" name="Picture 6"/>
@@ -2049,7 +2049,7 @@
           <w:color w:val="0F3460"/>
           <w:sz w:val="26"/>
         </w:rPr>
-        <w:t>Status &amp; Next Steps</w:t>
+        <w:t>Status</w:t>
       </w:r>
     </w:p>
     <w:p>
@@ -2059,15 +2059,6 @@
       </w:pPr>
       <w:r>
         <w:t>Built &amp; demonstrated: FL simulation (Flower + FedAvg, Docker/local), Paillier + DP-SGD privacy layer, live React/FastAPI dashboard, real OULAD data pipeline, centralised baseline.</w:t>
-      </w:r>
-    </w:p>
-    <w:p>
-      <w:pPr>
-        <w:pStyle w:val="ListBullet"/>
-        <w:spacing w:after="40"/>
-      </w:pPr>
-      <w:r>
-        <w:t>Pending: formal multi-seed statistical significance test across independent partitions, and SUS usability study data collection (materials prepared, not yet administered).</w:t>
       </w:r>
     </w:p>
     <w:p>
@@ -2430,31 +2421,31 @@
       </w:rPr>
     </w:lvl>
   </w:abstractNum>
-  <w:num w:numId="1" w16cid:durableId="1740858399">
+  <w:num w:numId="1" w16cid:durableId="2104568095">
     <w:abstractNumId w:val="8"/>
   </w:num>
-  <w:num w:numId="2" w16cid:durableId="308901714">
+  <w:num w:numId="2" w16cid:durableId="1923906955">
     <w:abstractNumId w:val="6"/>
   </w:num>
-  <w:num w:numId="3" w16cid:durableId="118574880">
+  <w:num w:numId="3" w16cid:durableId="1508593362">
     <w:abstractNumId w:val="5"/>
   </w:num>
-  <w:num w:numId="4" w16cid:durableId="788547179">
+  <w:num w:numId="4" w16cid:durableId="1169636790">
     <w:abstractNumId w:val="4"/>
   </w:num>
-  <w:num w:numId="5" w16cid:durableId="631985338">
+  <w:num w:numId="5" w16cid:durableId="921187244">
     <w:abstractNumId w:val="7"/>
   </w:num>
-  <w:num w:numId="6" w16cid:durableId="894580597">
+  <w:num w:numId="6" w16cid:durableId="161821789">
     <w:abstractNumId w:val="3"/>
   </w:num>
-  <w:num w:numId="7" w16cid:durableId="190120061">
+  <w:num w:numId="7" w16cid:durableId="493837962">
     <w:abstractNumId w:val="2"/>
   </w:num>
-  <w:num w:numId="8" w16cid:durableId="588736374">
+  <w:num w:numId="8" w16cid:durableId="821505849">
     <w:abstractNumId w:val="1"/>
   </w:num>
-  <w:num w:numId="9" w16cid:durableId="1009988004">
+  <w:num w:numId="9" w16cid:durableId="1182814573">
     <w:abstractNumId w:val="0"/>
   </w:num>
 </w:numbering>

</xml_diff>

<commit_message>
Bring README up to date for submission; de-italicise report byline
README: fix placeholder repo URL, correct FastAPI version (0.110.0,
not 0.111.0 — pinned to avoid a typer conflict with flwr), document
every script in scripts/ (several were missing from the directory
tree), add a Submission Materials table linking the report/video/
proposal, mark the Pi deployment step as optional and not yet
benchmarked, and drop the Objective-3-only success metric.

Report: supervisor name and the group/project byline are now bold
where appropriate with a normal (non-italic) font, matching the
rest of the document.
</commit_message>
<xml_diff>
--- a/FL_Ghana_Progress_Report.docx
+++ b/FL_Ghana_Progress_Report.docx
@@ -30,7 +30,6 @@
       </w:pPr>
       <w:r>
         <w:rPr>
-          <w:i/>
           <w:color w:val="6B7280"/>
           <w:sz w:val="19"/>
         </w:rPr>
@@ -39,7 +38,6 @@
       <w:r>
         <w:rPr>
           <w:b/>
-          <w:i/>
           <w:color w:val="6B7280"/>
           <w:sz w:val="19"/>
         </w:rPr>
@@ -747,7 +745,7 @@
                 <w:noProof/>
               </w:rPr>
               <w:drawing>
-                <wp:inline distT="0" distB="0" distL="0" distR="0" wp14:anchorId="22A59FA8" wp14:editId="46EAB26B">
+                <wp:inline distT="0" distB="0" distL="0" distR="0" wp14:anchorId="00C56404" wp14:editId="2F9AA8DF">
                   <wp:extent cx="2377440" cy="1485900"/>
                   <wp:effectExtent l="0" t="0" r="0" b="0"/>
                   <wp:docPr id="1" name="Picture 1"/>
@@ -803,7 +801,7 @@
                 <w:noProof/>
               </w:rPr>
               <w:drawing>
-                <wp:inline distT="0" distB="0" distL="0" distR="0" wp14:anchorId="34CB8A2A" wp14:editId="7F80382F">
+                <wp:inline distT="0" distB="0" distL="0" distR="0" wp14:anchorId="5B4D4E6D" wp14:editId="3FC681A7">
                   <wp:extent cx="2377440" cy="1485900"/>
                   <wp:effectExtent l="0" t="0" r="0" b="0"/>
                   <wp:docPr id="2" name="Picture 2"/>
@@ -907,7 +905,7 @@
                 <w:noProof/>
               </w:rPr>
               <w:drawing>
-                <wp:inline distT="0" distB="0" distL="0" distR="0" wp14:anchorId="74F8557D" wp14:editId="75F48455">
+                <wp:inline distT="0" distB="0" distL="0" distR="0" wp14:anchorId="3D68C1EE" wp14:editId="76E48E44">
                   <wp:extent cx="2377440" cy="1485900"/>
                   <wp:effectExtent l="0" t="0" r="0" b="0"/>
                   <wp:docPr id="3" name="Picture 3"/>
@@ -963,7 +961,7 @@
                 <w:noProof/>
               </w:rPr>
               <w:drawing>
-                <wp:inline distT="0" distB="0" distL="0" distR="0" wp14:anchorId="4085AEAF" wp14:editId="638B4883">
+                <wp:inline distT="0" distB="0" distL="0" distR="0" wp14:anchorId="3932B97E" wp14:editId="6A02FB1A">
                   <wp:extent cx="2377440" cy="1485900"/>
                   <wp:effectExtent l="0" t="0" r="0" b="0"/>
                   <wp:docPr id="4" name="Picture 4"/>
@@ -1861,7 +1859,7 @@
                 <w:noProof/>
               </w:rPr>
               <w:drawing>
-                <wp:inline distT="0" distB="0" distL="0" distR="0" wp14:anchorId="7169BABB" wp14:editId="002D7C6B">
+                <wp:inline distT="0" distB="0" distL="0" distR="0" wp14:anchorId="0F67F69B" wp14:editId="226C49D7">
                   <wp:extent cx="2834640" cy="1771650"/>
                   <wp:effectExtent l="0" t="0" r="0" b="0"/>
                   <wp:docPr id="5" name="Picture 5"/>
@@ -1917,7 +1915,7 @@
                 <w:noProof/>
               </w:rPr>
               <w:drawing>
-                <wp:inline distT="0" distB="0" distL="0" distR="0" wp14:anchorId="6C0AB84F" wp14:editId="724DABAE">
+                <wp:inline distT="0" distB="0" distL="0" distR="0" wp14:anchorId="2F59730E" wp14:editId="159FB189">
                   <wp:extent cx="2834640" cy="1771650"/>
                   <wp:effectExtent l="0" t="0" r="0" b="0"/>
                   <wp:docPr id="6" name="Picture 6"/>
@@ -2421,31 +2419,31 @@
       </w:rPr>
     </w:lvl>
   </w:abstractNum>
-  <w:num w:numId="1" w16cid:durableId="2104568095">
+  <w:num w:numId="1" w16cid:durableId="511995348">
     <w:abstractNumId w:val="8"/>
   </w:num>
-  <w:num w:numId="2" w16cid:durableId="1923906955">
+  <w:num w:numId="2" w16cid:durableId="523981314">
     <w:abstractNumId w:val="6"/>
   </w:num>
-  <w:num w:numId="3" w16cid:durableId="1508593362">
+  <w:num w:numId="3" w16cid:durableId="56168773">
     <w:abstractNumId w:val="5"/>
   </w:num>
-  <w:num w:numId="4" w16cid:durableId="1169636790">
+  <w:num w:numId="4" w16cid:durableId="1748190250">
     <w:abstractNumId w:val="4"/>
   </w:num>
-  <w:num w:numId="5" w16cid:durableId="921187244">
+  <w:num w:numId="5" w16cid:durableId="1962803294">
     <w:abstractNumId w:val="7"/>
   </w:num>
-  <w:num w:numId="6" w16cid:durableId="161821789">
+  <w:num w:numId="6" w16cid:durableId="1582063154">
     <w:abstractNumId w:val="3"/>
   </w:num>
-  <w:num w:numId="7" w16cid:durableId="493837962">
+  <w:num w:numId="7" w16cid:durableId="1458179884">
     <w:abstractNumId w:val="2"/>
   </w:num>
-  <w:num w:numId="8" w16cid:durableId="821505849">
+  <w:num w:numId="8" w16cid:durableId="669867701">
     <w:abstractNumId w:val="1"/>
   </w:num>
-  <w:num w:numId="9" w16cid:durableId="1182814573">
+  <w:num w:numId="9" w16cid:durableId="760218803">
     <w:abstractNumId w:val="0"/>
   </w:num>
 </w:numbering>

</xml_diff>